<commit_message>
Complete SmartShelf database schema
</commit_message>
<xml_diff>
--- a/docs/SmartShelf System Specification Updated.docx
+++ b/docs/SmartShelf System Specification Updated.docx
@@ -16080,13 +16080,7 @@
     </w:p>
     <w:p>
       <w:r>
-        <w:rPr>
-          <w:b/>
-        </w:rPr>
-        <w:t xml:space="preserve">Current implementation. </w:t>
-      </w:r>
-      <w:r>
-        <w:t>The delivered SmartShelf application uses PostgreSQL. Its supplied database schema and migration scripts define the tables below. Users are stored in one MEMBER table, and their access level is stored in MEMBER.role as STUDENT, STAFF, or ADMIN.</w:t>
+        <w:t>Current implementation. SmartShelf uses PostgreSQL through the Flask application in smart-library-system. The consolidated schema creates all 19 tables required by the implemented application. Users are stored in one MEMBER table, and MEMBER.role stores STUDENT, STAFF, or ADMIN access levels.</w:t>
       </w:r>
     </w:p>
     <w:p>
@@ -16117,15 +16111,9 @@
             <w:vAlign w:val="center"/>
           </w:tcPr>
           <w:p>
-            <w:pPr>
-              <w:spacing w:after="0" w:before="0"/>
-            </w:pPr>
-            <w:r/>
             <w:r>
               <w:rPr>
-                <w:b/>
-                <w:color w:val="FFFFFF"/>
-                <w:sz w:val="17"/>
+                <w:rFonts w:ascii="Arial" w:hAnsi="Arial"/>
               </w:rPr>
               <w:t>Table</w:t>
             </w:r>
@@ -16138,15 +16126,9 @@
             <w:vAlign w:val="center"/>
           </w:tcPr>
           <w:p>
-            <w:pPr>
-              <w:spacing w:after="0" w:before="0"/>
-            </w:pPr>
-            <w:r/>
             <w:r>
               <w:rPr>
-                <w:b/>
-                <w:color w:val="FFFFFF"/>
-                <w:sz w:val="17"/>
+                <w:rFonts w:ascii="Arial" w:hAnsi="Arial"/>
               </w:rPr>
               <w:t>Columns and PostgreSQL types</w:t>
             </w:r>
@@ -16159,15 +16141,9 @@
             <w:vAlign w:val="center"/>
           </w:tcPr>
           <w:p>
-            <w:pPr>
-              <w:spacing w:after="0" w:before="0"/>
-            </w:pPr>
-            <w:r/>
             <w:r>
               <w:rPr>
-                <w:b/>
-                <w:color w:val="FFFFFF"/>
-                <w:sz w:val="17"/>
+                <w:rFonts w:ascii="Arial" w:hAnsi="Arial"/>
               </w:rPr>
               <w:t>Keys and constraints</w:t>
             </w:r>
@@ -16177,18 +16153,12 @@
       <w:tr>
         <w:tc>
           <w:tcPr>
-            <w:tcW w:type="dxa" w:w="1584"/>
-            <w:vAlign w:val="center"/>
+            <w:tcW w:type="dxa" w:w="3009"/>
           </w:tcPr>
           <w:p>
-            <w:pPr>
-              <w:spacing w:after="0" w:before="0"/>
-            </w:pPr>
-            <w:r/>
             <w:r>
               <w:rPr>
-                <w:b w:val="0"/>
-                <w:sz w:val="17"/>
+                <w:rFonts w:ascii="Arial" w:hAnsi="Arial"/>
               </w:rPr>
               <w:t>CATEGORY</w:t>
             </w:r>
@@ -16196,18 +16166,12 @@
         </w:tc>
         <w:tc>
           <w:tcPr>
-            <w:tcW w:type="dxa" w:w="5472"/>
-            <w:vAlign w:val="center"/>
+            <w:tcW w:type="dxa" w:w="3009"/>
           </w:tcPr>
           <w:p>
-            <w:pPr>
-              <w:spacing w:after="0" w:before="0"/>
-            </w:pPr>
-            <w:r/>
             <w:r>
               <w:rPr>
-                <w:b w:val="0"/>
-                <w:sz w:val="17"/>
+                <w:rFonts w:ascii="Arial" w:hAnsi="Arial"/>
               </w:rPr>
               <w:t>id SERIAL; category_name VARCHAR(100)</w:t>
             </w:r>
@@ -16215,20 +16179,14 @@
         </w:tc>
         <w:tc>
           <w:tcPr>
-            <w:tcW w:type="dxa" w:w="3024"/>
-            <w:vAlign w:val="center"/>
+            <w:tcW w:type="dxa" w:w="3009"/>
           </w:tcPr>
           <w:p>
-            <w:pPr>
-              <w:spacing w:after="0" w:before="0"/>
-            </w:pPr>
-            <w:r/>
             <w:r>
               <w:rPr>
-                <w:b w:val="0"/>
-                <w:sz w:val="17"/>
+                <w:rFonts w:ascii="Arial" w:hAnsi="Arial"/>
               </w:rPr>
-              <w:t>id is PK; category_name is NOT NULL.</w:t>
+              <w:t>id is PK; category_name is UNIQUE and NOT NULL.</w:t>
             </w:r>
           </w:p>
         </w:tc>
@@ -16236,18 +16194,12 @@
       <w:tr>
         <w:tc>
           <w:tcPr>
-            <w:tcW w:type="dxa" w:w="1584"/>
-            <w:vAlign w:val="center"/>
+            <w:tcW w:type="dxa" w:w="3009"/>
           </w:tcPr>
           <w:p>
-            <w:pPr>
-              <w:spacing w:after="0" w:before="0"/>
-            </w:pPr>
-            <w:r/>
             <w:r>
               <w:rPr>
-                <w:b w:val="0"/>
-                <w:sz w:val="17"/>
+                <w:rFonts w:ascii="Arial" w:hAnsi="Arial"/>
               </w:rPr>
               <w:t>AUTHOR</w:t>
             </w:r>
@@ -16255,18 +16207,12 @@
         </w:tc>
         <w:tc>
           <w:tcPr>
-            <w:tcW w:type="dxa" w:w="5472"/>
-            <w:vAlign w:val="center"/>
+            <w:tcW w:type="dxa" w:w="3009"/>
           </w:tcPr>
           <w:p>
-            <w:pPr>
-              <w:spacing w:after="0" w:before="0"/>
-            </w:pPr>
-            <w:r/>
             <w:r>
               <w:rPr>
-                <w:b w:val="0"/>
-                <w:sz w:val="17"/>
+                <w:rFonts w:ascii="Arial" w:hAnsi="Arial"/>
               </w:rPr>
               <w:t>id SERIAL; first_name VARCHAR(100); last_name VARCHAR(100)</w:t>
             </w:r>
@@ -16274,20 +16220,14 @@
         </w:tc>
         <w:tc>
           <w:tcPr>
-            <w:tcW w:type="dxa" w:w="3024"/>
-            <w:vAlign w:val="center"/>
+            <w:tcW w:type="dxa" w:w="3009"/>
           </w:tcPr>
           <w:p>
-            <w:pPr>
-              <w:spacing w:after="0" w:before="0"/>
-            </w:pPr>
-            <w:r/>
             <w:r>
               <w:rPr>
-                <w:b w:val="0"/>
-                <w:sz w:val="17"/>
+                <w:rFonts w:ascii="Arial" w:hAnsi="Arial"/>
               </w:rPr>
-              <w:t>id is PK; first_name and last_name are NOT NULL.</w:t>
+              <w:t>id is PK; names are NOT NULL; first_name and last_name are unique together.</w:t>
             </w:r>
           </w:p>
         </w:tc>
@@ -16295,18 +16235,12 @@
       <w:tr>
         <w:tc>
           <w:tcPr>
-            <w:tcW w:type="dxa" w:w="1584"/>
-            <w:vAlign w:val="center"/>
+            <w:tcW w:type="dxa" w:w="3009"/>
           </w:tcPr>
           <w:p>
-            <w:pPr>
-              <w:spacing w:after="0" w:before="0"/>
-            </w:pPr>
-            <w:r/>
             <w:r>
               <w:rPr>
-                <w:b w:val="0"/>
-                <w:sz w:val="17"/>
+                <w:rFonts w:ascii="Arial" w:hAnsi="Arial"/>
               </w:rPr>
               <w:t>MEMBER_STATUS</w:t>
             </w:r>
@@ -16314,18 +16248,12 @@
         </w:tc>
         <w:tc>
           <w:tcPr>
-            <w:tcW w:type="dxa" w:w="5472"/>
-            <w:vAlign w:val="center"/>
+            <w:tcW w:type="dxa" w:w="3009"/>
           </w:tcPr>
           <w:p>
-            <w:pPr>
-              <w:spacing w:after="0" w:before="0"/>
-            </w:pPr>
-            <w:r/>
             <w:r>
               <w:rPr>
-                <w:b w:val="0"/>
-                <w:sz w:val="17"/>
+                <w:rFonts w:ascii="Arial" w:hAnsi="Arial"/>
               </w:rPr>
               <w:t>id SERIAL; status_value VARCHAR(50)</w:t>
             </w:r>
@@ -16333,20 +16261,14 @@
         </w:tc>
         <w:tc>
           <w:tcPr>
-            <w:tcW w:type="dxa" w:w="3024"/>
-            <w:vAlign w:val="center"/>
+            <w:tcW w:type="dxa" w:w="3009"/>
           </w:tcPr>
           <w:p>
-            <w:pPr>
-              <w:spacing w:after="0" w:before="0"/>
-            </w:pPr>
-            <w:r/>
             <w:r>
               <w:rPr>
-                <w:b w:val="0"/>
-                <w:sz w:val="17"/>
+                <w:rFonts w:ascii="Arial" w:hAnsi="Arial"/>
               </w:rPr>
-              <w:t>id is PK; status_value is NOT NULL. Used for Active, Inactive, and Suspended states.</w:t>
+              <w:t>id is PK; status_value is UNIQUE and NOT NULL.</w:t>
             </w:r>
           </w:p>
         </w:tc>
@@ -16354,18 +16276,12 @@
       <w:tr>
         <w:tc>
           <w:tcPr>
-            <w:tcW w:type="dxa" w:w="1584"/>
-            <w:vAlign w:val="center"/>
+            <w:tcW w:type="dxa" w:w="3009"/>
           </w:tcPr>
           <w:p>
-            <w:pPr>
-              <w:spacing w:after="0" w:before="0"/>
-            </w:pPr>
-            <w:r/>
             <w:r>
               <w:rPr>
-                <w:b w:val="0"/>
-                <w:sz w:val="17"/>
+                <w:rFonts w:ascii="Arial" w:hAnsi="Arial"/>
               </w:rPr>
               <w:t>MEMBER</w:t>
             </w:r>
@@ -16373,18 +16289,12 @@
         </w:tc>
         <w:tc>
           <w:tcPr>
-            <w:tcW w:type="dxa" w:w="5472"/>
-            <w:vAlign w:val="center"/>
+            <w:tcW w:type="dxa" w:w="3009"/>
           </w:tcPr>
           <w:p>
-            <w:pPr>
-              <w:spacing w:after="0" w:before="0"/>
-            </w:pPr>
-            <w:r/>
             <w:r>
               <w:rPr>
-                <w:b w:val="0"/>
-                <w:sz w:val="17"/>
+                <w:rFonts w:ascii="Arial" w:hAnsi="Arial"/>
               </w:rPr>
               <w:t>id SERIAL; first_name VARCHAR(100); last_name VARCHAR(100); joined_date DATE; active_status_id INTEGER; email VARCHAR(255); password_hash VARCHAR(255); role VARCHAR(20); faculty VARCHAR(100)</w:t>
             </w:r>
@@ -16392,20 +16302,14 @@
         </w:tc>
         <w:tc>
           <w:tcPr>
-            <w:tcW w:type="dxa" w:w="3024"/>
-            <w:vAlign w:val="center"/>
+            <w:tcW w:type="dxa" w:w="3009"/>
           </w:tcPr>
           <w:p>
-            <w:pPr>
-              <w:spacing w:after="0" w:before="0"/>
-            </w:pPr>
-            <w:r/>
             <w:r>
               <w:rPr>
-                <w:b w:val="0"/>
-                <w:sz w:val="17"/>
+                <w:rFonts w:ascii="Arial" w:hAnsi="Arial"/>
               </w:rPr>
-              <w:t>id is PK; first_name and last_name are NOT NULL; joined_date defaults to CURRENT_DATE; active_status_id is FK to MEMBER_STATUS; email is UNIQUE; role defaults to student.</w:t>
+              <w:t>id is PK; active_status_id is FK to MEMBER_STATUS; email is UNIQUE; role is STUDENT, STAFF, or ADMIN.</w:t>
             </w:r>
           </w:p>
         </w:tc>
@@ -16413,18 +16317,12 @@
       <w:tr>
         <w:tc>
           <w:tcPr>
-            <w:tcW w:type="dxa" w:w="1584"/>
-            <w:vAlign w:val="center"/>
+            <w:tcW w:type="dxa" w:w="3009"/>
           </w:tcPr>
           <w:p>
-            <w:pPr>
-              <w:spacing w:after="0" w:before="0"/>
-            </w:pPr>
-            <w:r/>
             <w:r>
               <w:rPr>
-                <w:b w:val="0"/>
-                <w:sz w:val="17"/>
+                <w:rFonts w:ascii="Arial" w:hAnsi="Arial"/>
               </w:rPr>
               <w:t>BOOK</w:t>
             </w:r>
@@ -16432,18 +16330,12 @@
         </w:tc>
         <w:tc>
           <w:tcPr>
-            <w:tcW w:type="dxa" w:w="5472"/>
-            <w:vAlign w:val="center"/>
+            <w:tcW w:type="dxa" w:w="3009"/>
           </w:tcPr>
           <w:p>
-            <w:pPr>
-              <w:spacing w:after="0" w:before="0"/>
-            </w:pPr>
-            <w:r/>
             <w:r>
               <w:rPr>
-                <w:b w:val="0"/>
-                <w:sz w:val="17"/>
+                <w:rFonts w:ascii="Arial" w:hAnsi="Arial"/>
               </w:rPr>
               <w:t>id SERIAL; title VARCHAR(255); category_id INTEGER; publication_date DATE; copies_owned INTEGER</w:t>
             </w:r>
@@ -16451,20 +16343,14 @@
         </w:tc>
         <w:tc>
           <w:tcPr>
-            <w:tcW w:type="dxa" w:w="3024"/>
-            <w:vAlign w:val="center"/>
+            <w:tcW w:type="dxa" w:w="3009"/>
           </w:tcPr>
           <w:p>
-            <w:pPr>
-              <w:spacing w:after="0" w:before="0"/>
-            </w:pPr>
-            <w:r/>
             <w:r>
               <w:rPr>
-                <w:b w:val="0"/>
-                <w:sz w:val="17"/>
+                <w:rFonts w:ascii="Arial" w:hAnsi="Arial"/>
               </w:rPr>
-              <w:t>id is PK; title is NOT NULL; category_id is FK to CATEGORY; copies_owned defaults to 1.</w:t>
+              <w:t>id is PK; category_id is FK to CATEGORY; copies_owned cannot be negative.</w:t>
             </w:r>
           </w:p>
         </w:tc>
@@ -16472,18 +16358,12 @@
       <w:tr>
         <w:tc>
           <w:tcPr>
-            <w:tcW w:type="dxa" w:w="1584"/>
-            <w:vAlign w:val="center"/>
+            <w:tcW w:type="dxa" w:w="3009"/>
           </w:tcPr>
           <w:p>
-            <w:pPr>
-              <w:spacing w:after="0" w:before="0"/>
-            </w:pPr>
-            <w:r/>
             <w:r>
               <w:rPr>
-                <w:b w:val="0"/>
-                <w:sz w:val="17"/>
+                <w:rFonts w:ascii="Arial" w:hAnsi="Arial"/>
               </w:rPr>
               <w:t>BOOK_COPY</w:t>
             </w:r>
@@ -16491,39 +16371,27 @@
         </w:tc>
         <w:tc>
           <w:tcPr>
-            <w:tcW w:type="dxa" w:w="5472"/>
-            <w:vAlign w:val="center"/>
+            <w:tcW w:type="dxa" w:w="3009"/>
           </w:tcPr>
           <w:p>
-            <w:pPr>
-              <w:spacing w:after="0" w:before="0"/>
-            </w:pPr>
-            <w:r/>
             <w:r>
               <w:rPr>
-                <w:b w:val="0"/>
-                <w:sz w:val="17"/>
+                <w:rFonts w:ascii="Arial" w:hAnsi="Arial"/>
               </w:rPr>
-              <w:t>Referenced by the application for physical-copy inventory and availability.</w:t>
+              <w:t>copy_id SERIAL; book_id INTEGER; barcode VARCHAR(100); copy_status VARCHAR(20)</w:t>
             </w:r>
           </w:p>
         </w:tc>
         <w:tc>
           <w:tcPr>
-            <w:tcW w:type="dxa" w:w="3024"/>
-            <w:vAlign w:val="center"/>
+            <w:tcW w:type="dxa" w:w="3009"/>
           </w:tcPr>
           <w:p>
-            <w:pPr>
-              <w:spacing w:after="0" w:before="0"/>
-            </w:pPr>
-            <w:r/>
             <w:r>
               <w:rPr>
-                <w:b w:val="0"/>
-                <w:sz w:val="17"/>
+                <w:rFonts w:ascii="Arial" w:hAnsi="Arial"/>
               </w:rPr>
-              <w:t>The supplied schema does not yet define this table. See implementation gaps below.</w:t>
+              <w:t>copy_id is PK; book_id is FK to BOOK; barcode is UNIQUE; status is controlled (AVAILABLE, BORROWED, RESERVED, LOST, DAMAGED, or MAINTENANCE).</w:t>
             </w:r>
           </w:p>
         </w:tc>
@@ -16531,18 +16399,12 @@
       <w:tr>
         <w:tc>
           <w:tcPr>
-            <w:tcW w:type="dxa" w:w="1584"/>
-            <w:vAlign w:val="center"/>
+            <w:tcW w:type="dxa" w:w="3009"/>
           </w:tcPr>
           <w:p>
-            <w:pPr>
-              <w:spacing w:after="0" w:before="0"/>
-            </w:pPr>
-            <w:r/>
             <w:r>
               <w:rPr>
-                <w:b w:val="0"/>
-                <w:sz w:val="17"/>
+                <w:rFonts w:ascii="Arial" w:hAnsi="Arial"/>
               </w:rPr>
               <w:t>BOOK_AUTHOR</w:t>
             </w:r>
@@ -16550,18 +16412,12 @@
         </w:tc>
         <w:tc>
           <w:tcPr>
-            <w:tcW w:type="dxa" w:w="5472"/>
-            <w:vAlign w:val="center"/>
+            <w:tcW w:type="dxa" w:w="3009"/>
           </w:tcPr>
           <w:p>
-            <w:pPr>
-              <w:spacing w:after="0" w:before="0"/>
-            </w:pPr>
-            <w:r/>
             <w:r>
               <w:rPr>
-                <w:b w:val="0"/>
-                <w:sz w:val="17"/>
+                <w:rFonts w:ascii="Arial" w:hAnsi="Arial"/>
               </w:rPr>
               <w:t>book_id INTEGER; author_id INTEGER</w:t>
             </w:r>
@@ -16569,18 +16425,12 @@
         </w:tc>
         <w:tc>
           <w:tcPr>
-            <w:tcW w:type="dxa" w:w="3024"/>
-            <w:vAlign w:val="center"/>
+            <w:tcW w:type="dxa" w:w="3009"/>
           </w:tcPr>
           <w:p>
-            <w:pPr>
-              <w:spacing w:after="0" w:before="0"/>
-            </w:pPr>
-            <w:r/>
             <w:r>
               <w:rPr>
-                <w:b w:val="0"/>
-                <w:sz w:val="17"/>
+                <w:rFonts w:ascii="Arial" w:hAnsi="Arial"/>
               </w:rPr>
               <w:t>Composite PK (book_id, author_id); both columns are FKs to BOOK and AUTHOR.</w:t>
             </w:r>
@@ -16617,15 +16467,9 @@
             <w:vAlign w:val="center"/>
           </w:tcPr>
           <w:p>
-            <w:pPr>
-              <w:spacing w:after="0" w:before="0"/>
-            </w:pPr>
-            <w:r/>
             <w:r>
               <w:rPr>
-                <w:b/>
-                <w:color w:val="FFFFFF"/>
-                <w:sz w:val="17"/>
+                <w:rFonts w:ascii="Arial" w:hAnsi="Arial"/>
               </w:rPr>
               <w:t>Table</w:t>
             </w:r>
@@ -16638,15 +16482,9 @@
             <w:vAlign w:val="center"/>
           </w:tcPr>
           <w:p>
-            <w:pPr>
-              <w:spacing w:after="0" w:before="0"/>
-            </w:pPr>
-            <w:r/>
             <w:r>
               <w:rPr>
-                <w:b/>
-                <w:color w:val="FFFFFF"/>
-                <w:sz w:val="17"/>
+                <w:rFonts w:ascii="Arial" w:hAnsi="Arial"/>
               </w:rPr>
               <w:t>Columns and PostgreSQL types</w:t>
             </w:r>
@@ -16659,15 +16497,9 @@
             <w:vAlign w:val="center"/>
           </w:tcPr>
           <w:p>
-            <w:pPr>
-              <w:spacing w:after="0" w:before="0"/>
-            </w:pPr>
-            <w:r/>
             <w:r>
               <w:rPr>
-                <w:b/>
-                <w:color w:val="FFFFFF"/>
-                <w:sz w:val="17"/>
+                <w:rFonts w:ascii="Arial" w:hAnsi="Arial"/>
               </w:rPr>
               <w:t>Keys and constraints</w:t>
             </w:r>
@@ -16677,18 +16509,12 @@
       <w:tr>
         <w:tc>
           <w:tcPr>
-            <w:tcW w:type="dxa" w:w="1584"/>
-            <w:vAlign w:val="center"/>
+            <w:tcW w:type="dxa" w:w="3009"/>
           </w:tcPr>
           <w:p>
-            <w:pPr>
-              <w:spacing w:after="0" w:before="0"/>
-            </w:pPr>
-            <w:r/>
             <w:r>
               <w:rPr>
-                <w:b w:val="0"/>
-                <w:sz w:val="17"/>
+                <w:rFonts w:ascii="Arial" w:hAnsi="Arial"/>
               </w:rPr>
               <w:t>LOAN</w:t>
             </w:r>
@@ -16696,39 +16522,27 @@
         </w:tc>
         <w:tc>
           <w:tcPr>
-            <w:tcW w:type="dxa" w:w="5472"/>
-            <w:vAlign w:val="center"/>
+            <w:tcW w:type="dxa" w:w="3009"/>
           </w:tcPr>
           <w:p>
-            <w:pPr>
-              <w:spacing w:after="0" w:before="0"/>
-            </w:pPr>
-            <w:r/>
             <w:r>
               <w:rPr>
-                <w:b w:val="0"/>
-                <w:sz w:val="17"/>
+                <w:rFonts w:ascii="Arial" w:hAnsi="Arial"/>
               </w:rPr>
-              <w:t>id SERIAL; book_id INTEGER; member_id INTEGER; loan_date DATE; returned_date DATE; due_date DATE</w:t>
+              <w:t>id SERIAL; book_id INTEGER; member_id INTEGER; copy_id INTEGER; loan_date DATE; due_date DATE; returned_date DATE</w:t>
             </w:r>
           </w:p>
         </w:tc>
         <w:tc>
           <w:tcPr>
-            <w:tcW w:type="dxa" w:w="3024"/>
-            <w:vAlign w:val="center"/>
+            <w:tcW w:type="dxa" w:w="3009"/>
           </w:tcPr>
           <w:p>
-            <w:pPr>
-              <w:spacing w:after="0" w:before="0"/>
-            </w:pPr>
-            <w:r/>
             <w:r>
               <w:rPr>
-                <w:b w:val="0"/>
-                <w:sz w:val="17"/>
+                <w:rFonts w:ascii="Arial" w:hAnsi="Arial"/>
               </w:rPr>
-              <w:t>id is PK; book_id is FK to BOOK; member_id is FK to MEMBER; loan_date defaults to CURRENT_DATE; due_date is added by migration.</w:t>
+              <w:t>id is PK; book_id, member_id, and copy_id are FKs; one copy can have only one active loan.</w:t>
             </w:r>
           </w:p>
         </w:tc>
@@ -16736,18 +16550,12 @@
       <w:tr>
         <w:tc>
           <w:tcPr>
-            <w:tcW w:type="dxa" w:w="1584"/>
-            <w:vAlign w:val="center"/>
+            <w:tcW w:type="dxa" w:w="3009"/>
           </w:tcPr>
           <w:p>
-            <w:pPr>
-              <w:spacing w:after="0" w:before="0"/>
-            </w:pPr>
-            <w:r/>
             <w:r>
               <w:rPr>
-                <w:b w:val="0"/>
-                <w:sz w:val="17"/>
+                <w:rFonts w:ascii="Arial" w:hAnsi="Arial"/>
               </w:rPr>
               <w:t>RESERVATION_STATUS</w:t>
             </w:r>
@@ -16755,18 +16563,12 @@
         </w:tc>
         <w:tc>
           <w:tcPr>
-            <w:tcW w:type="dxa" w:w="5472"/>
-            <w:vAlign w:val="center"/>
+            <w:tcW w:type="dxa" w:w="3009"/>
           </w:tcPr>
           <w:p>
-            <w:pPr>
-              <w:spacing w:after="0" w:before="0"/>
-            </w:pPr>
-            <w:r/>
             <w:r>
               <w:rPr>
-                <w:b w:val="0"/>
-                <w:sz w:val="17"/>
+                <w:rFonts w:ascii="Arial" w:hAnsi="Arial"/>
               </w:rPr>
               <w:t>id SERIAL; status_value VARCHAR(50)</w:t>
             </w:r>
@@ -16774,20 +16576,14 @@
         </w:tc>
         <w:tc>
           <w:tcPr>
-            <w:tcW w:type="dxa" w:w="3024"/>
-            <w:vAlign w:val="center"/>
+            <w:tcW w:type="dxa" w:w="3009"/>
           </w:tcPr>
           <w:p>
-            <w:pPr>
-              <w:spacing w:after="0" w:before="0"/>
-            </w:pPr>
-            <w:r/>
             <w:r>
               <w:rPr>
-                <w:b w:val="0"/>
-                <w:sz w:val="17"/>
+                <w:rFonts w:ascii="Arial" w:hAnsi="Arial"/>
               </w:rPr>
-              <w:t>id is PK; status_value is NOT NULL. Used for Pending, Fulfilled, and Cancelled states.</w:t>
+              <w:t>id is PK; status_value is UNIQUE and NOT NULL.</w:t>
             </w:r>
           </w:p>
         </w:tc>
@@ -16795,18 +16591,12 @@
       <w:tr>
         <w:tc>
           <w:tcPr>
-            <w:tcW w:type="dxa" w:w="1584"/>
-            <w:vAlign w:val="center"/>
+            <w:tcW w:type="dxa" w:w="3009"/>
           </w:tcPr>
           <w:p>
-            <w:pPr>
-              <w:spacing w:after="0" w:before="0"/>
-            </w:pPr>
-            <w:r/>
             <w:r>
               <w:rPr>
-                <w:b w:val="0"/>
-                <w:sz w:val="17"/>
+                <w:rFonts w:ascii="Arial" w:hAnsi="Arial"/>
               </w:rPr>
               <w:t>RESERVATION</w:t>
             </w:r>
@@ -16814,39 +16604,27 @@
         </w:tc>
         <w:tc>
           <w:tcPr>
-            <w:tcW w:type="dxa" w:w="5472"/>
-            <w:vAlign w:val="center"/>
+            <w:tcW w:type="dxa" w:w="3009"/>
           </w:tcPr>
           <w:p>
-            <w:pPr>
-              <w:spacing w:after="0" w:before="0"/>
-            </w:pPr>
-            <w:r/>
             <w:r>
               <w:rPr>
-                <w:b w:val="0"/>
-                <w:sz w:val="17"/>
+                <w:rFonts w:ascii="Arial" w:hAnsi="Arial"/>
               </w:rPr>
-              <w:t>id SERIAL; book_id INTEGER; member_id INTEGER; reservation_date DATE; reservation_status_id INTEGER</w:t>
+              <w:t>id SERIAL; book_id INTEGER; member_id INTEGER; reservation_date DATE; reservation_status_id INTEGER; queue_position INTEGER; allocated_copy_id INTEGER; expires_at DATE</w:t>
             </w:r>
           </w:p>
         </w:tc>
         <w:tc>
           <w:tcPr>
-            <w:tcW w:type="dxa" w:w="3024"/>
-            <w:vAlign w:val="center"/>
+            <w:tcW w:type="dxa" w:w="3009"/>
           </w:tcPr>
           <w:p>
-            <w:pPr>
-              <w:spacing w:after="0" w:before="0"/>
-            </w:pPr>
-            <w:r/>
             <w:r>
               <w:rPr>
-                <w:b w:val="0"/>
-                <w:sz w:val="17"/>
+                <w:rFonts w:ascii="Arial" w:hAnsi="Arial"/>
               </w:rPr>
-              <w:t>id is PK; book_id is FK to BOOK; member_id is FK to MEMBER; reservation_status_id is FK to RESERVATION_STATUS; reservation_date defaults to CURRENT_DATE.</w:t>
+              <w:t>id is PK; FKs to BOOK, MEMBER, RESERVATION_STATUS, and optionally BOOK_COPY; prevents duplicate active reservations for a member and book.</w:t>
             </w:r>
           </w:p>
         </w:tc>
@@ -16854,18 +16632,12 @@
       <w:tr>
         <w:tc>
           <w:tcPr>
-            <w:tcW w:type="dxa" w:w="1584"/>
-            <w:vAlign w:val="center"/>
+            <w:tcW w:type="dxa" w:w="3009"/>
           </w:tcPr>
           <w:p>
-            <w:pPr>
-              <w:spacing w:after="0" w:before="0"/>
-            </w:pPr>
-            <w:r/>
             <w:r>
               <w:rPr>
-                <w:b w:val="0"/>
-                <w:sz w:val="17"/>
+                <w:rFonts w:ascii="Arial" w:hAnsi="Arial"/>
               </w:rPr>
               <w:t>FINE</w:t>
             </w:r>
@@ -16873,18 +16645,12 @@
         </w:tc>
         <w:tc>
           <w:tcPr>
-            <w:tcW w:type="dxa" w:w="5472"/>
-            <w:vAlign w:val="center"/>
+            <w:tcW w:type="dxa" w:w="3009"/>
           </w:tcPr>
           <w:p>
-            <w:pPr>
-              <w:spacing w:after="0" w:before="0"/>
-            </w:pPr>
-            <w:r/>
             <w:r>
               <w:rPr>
-                <w:b w:val="0"/>
-                <w:sz w:val="17"/>
+                <w:rFonts w:ascii="Arial" w:hAnsi="Arial"/>
               </w:rPr>
               <w:t>id SERIAL; member_id INTEGER; loan_id INTEGER; fine_date DATE; fine_amount NUMERIC(10,2)</w:t>
             </w:r>
@@ -16892,20 +16658,14 @@
         </w:tc>
         <w:tc>
           <w:tcPr>
-            <w:tcW w:type="dxa" w:w="3024"/>
-            <w:vAlign w:val="center"/>
+            <w:tcW w:type="dxa" w:w="3009"/>
           </w:tcPr>
           <w:p>
-            <w:pPr>
-              <w:spacing w:after="0" w:before="0"/>
-            </w:pPr>
-            <w:r/>
             <w:r>
               <w:rPr>
-                <w:b w:val="0"/>
-                <w:sz w:val="17"/>
+                <w:rFonts w:ascii="Arial" w:hAnsi="Arial"/>
               </w:rPr>
-              <w:t>id is PK; member_id is FK to MEMBER; loan_id is FK to LOAN; fine_amount is NOT NULL; fine_date defaults to CURRENT_DATE.</w:t>
+              <w:t>id is PK; member_id and loan_id are FKs; fine_amount must be positive.</w:t>
             </w:r>
           </w:p>
         </w:tc>
@@ -16913,18 +16673,12 @@
       <w:tr>
         <w:tc>
           <w:tcPr>
-            <w:tcW w:type="dxa" w:w="1584"/>
-            <w:vAlign w:val="center"/>
+            <w:tcW w:type="dxa" w:w="3009"/>
           </w:tcPr>
           <w:p>
-            <w:pPr>
-              <w:spacing w:after="0" w:before="0"/>
-            </w:pPr>
-            <w:r/>
             <w:r>
               <w:rPr>
-                <w:b w:val="0"/>
-                <w:sz w:val="17"/>
+                <w:rFonts w:ascii="Arial" w:hAnsi="Arial"/>
               </w:rPr>
               <w:t>FINE_PAYMENT</w:t>
             </w:r>
@@ -16932,18 +16686,12 @@
         </w:tc>
         <w:tc>
           <w:tcPr>
-            <w:tcW w:type="dxa" w:w="5472"/>
-            <w:vAlign w:val="center"/>
+            <w:tcW w:type="dxa" w:w="3009"/>
           </w:tcPr>
           <w:p>
-            <w:pPr>
-              <w:spacing w:after="0" w:before="0"/>
-            </w:pPr>
-            <w:r/>
             <w:r>
               <w:rPr>
-                <w:b w:val="0"/>
-                <w:sz w:val="17"/>
+                <w:rFonts w:ascii="Arial" w:hAnsi="Arial"/>
               </w:rPr>
               <w:t>id SERIAL; member_id INTEGER; payment_date DATE; payment_amount NUMERIC(10,2)</w:t>
             </w:r>
@@ -16951,20 +16699,14 @@
         </w:tc>
         <w:tc>
           <w:tcPr>
-            <w:tcW w:type="dxa" w:w="3024"/>
-            <w:vAlign w:val="center"/>
+            <w:tcW w:type="dxa" w:w="3009"/>
           </w:tcPr>
           <w:p>
-            <w:pPr>
-              <w:spacing w:after="0" w:before="0"/>
-            </w:pPr>
-            <w:r/>
             <w:r>
               <w:rPr>
-                <w:b w:val="0"/>
-                <w:sz w:val="17"/>
+                <w:rFonts w:ascii="Arial" w:hAnsi="Arial"/>
               </w:rPr>
-              <w:t>id is PK; member_id is FK to MEMBER; payment_amount is NOT NULL; payment_date defaults to CURRENT_DATE.</w:t>
+              <w:t>id is PK; member_id is FK to MEMBER; payment_amount must be positive.</w:t>
             </w:r>
           </w:p>
         </w:tc>
@@ -16999,15 +16741,9 @@
             <w:vAlign w:val="center"/>
           </w:tcPr>
           <w:p>
-            <w:pPr>
-              <w:spacing w:after="0" w:before="0"/>
-            </w:pPr>
-            <w:r/>
             <w:r>
               <w:rPr>
-                <w:b/>
-                <w:color w:val="FFFFFF"/>
-                <w:sz w:val="17"/>
+                <w:rFonts w:ascii="Arial" w:hAnsi="Arial"/>
               </w:rPr>
               <w:t>Table</w:t>
             </w:r>
@@ -17020,15 +16756,9 @@
             <w:vAlign w:val="center"/>
           </w:tcPr>
           <w:p>
-            <w:pPr>
-              <w:spacing w:after="0" w:before="0"/>
-            </w:pPr>
-            <w:r/>
             <w:r>
               <w:rPr>
-                <w:b/>
-                <w:color w:val="FFFFFF"/>
-                <w:sz w:val="17"/>
+                <w:rFonts w:ascii="Arial" w:hAnsi="Arial"/>
               </w:rPr>
               <w:t>Columns and PostgreSQL types</w:t>
             </w:r>
@@ -17041,15 +16771,9 @@
             <w:vAlign w:val="center"/>
           </w:tcPr>
           <w:p>
-            <w:pPr>
-              <w:spacing w:after="0" w:before="0"/>
-            </w:pPr>
-            <w:r/>
             <w:r>
               <w:rPr>
-                <w:b/>
-                <w:color w:val="FFFFFF"/>
-                <w:sz w:val="17"/>
+                <w:rFonts w:ascii="Arial" w:hAnsi="Arial"/>
               </w:rPr>
               <w:t>Keys and constraints</w:t>
             </w:r>
@@ -17059,18 +16783,12 @@
       <w:tr>
         <w:tc>
           <w:tcPr>
-            <w:tcW w:type="dxa" w:w="1584"/>
-            <w:vAlign w:val="center"/>
+            <w:tcW w:type="dxa" w:w="3009"/>
           </w:tcPr>
           <w:p>
-            <w:pPr>
-              <w:spacing w:after="0" w:before="0"/>
-            </w:pPr>
-            <w:r/>
             <w:r>
               <w:rPr>
-                <w:b w:val="0"/>
-                <w:sz w:val="17"/>
+                <w:rFonts w:ascii="Arial" w:hAnsi="Arial"/>
               </w:rPr>
               <w:t>MEMBER_INTEREST</w:t>
             </w:r>
@@ -17078,18 +16796,12 @@
         </w:tc>
         <w:tc>
           <w:tcPr>
-            <w:tcW w:type="dxa" w:w="5472"/>
-            <w:vAlign w:val="center"/>
+            <w:tcW w:type="dxa" w:w="3009"/>
           </w:tcPr>
           <w:p>
-            <w:pPr>
-              <w:spacing w:after="0" w:before="0"/>
-            </w:pPr>
-            <w:r/>
             <w:r>
               <w:rPr>
-                <w:b w:val="0"/>
-                <w:sz w:val="17"/>
+                <w:rFonts w:ascii="Arial" w:hAnsi="Arial"/>
               </w:rPr>
               <w:t>member_id INTEGER; category_id INTEGER</w:t>
             </w:r>
@@ -17097,20 +16809,14 @@
         </w:tc>
         <w:tc>
           <w:tcPr>
-            <w:tcW w:type="dxa" w:w="3024"/>
-            <w:vAlign w:val="center"/>
+            <w:tcW w:type="dxa" w:w="3009"/>
           </w:tcPr>
           <w:p>
-            <w:pPr>
-              <w:spacing w:after="0" w:before="0"/>
-            </w:pPr>
-            <w:r/>
             <w:r>
               <w:rPr>
-                <w:b w:val="0"/>
-                <w:sz w:val="17"/>
+                <w:rFonts w:ascii="Arial" w:hAnsi="Arial"/>
               </w:rPr>
-              <w:t>Composite PK (member_id, category_id); both columns are FKs to MEMBER and CATEGORY.</w:t>
+              <w:t>Composite PK; both columns are FKs to MEMBER and CATEGORY.</w:t>
             </w:r>
           </w:p>
         </w:tc>
@@ -17118,18 +16824,176 @@
       <w:tr>
         <w:tc>
           <w:tcPr>
-            <w:tcW w:type="dxa" w:w="1584"/>
-            <w:vAlign w:val="center"/>
+            <w:tcW w:type="dxa" w:w="3009"/>
           </w:tcPr>
           <w:p>
-            <w:pPr>
-              <w:spacing w:after="0" w:before="0"/>
-            </w:pPr>
-            <w:r/>
             <w:r>
               <w:rPr>
-                <w:b w:val="0"/>
-                <w:sz w:val="17"/>
+                <w:rFonts w:ascii="Arial" w:hAnsi="Arial"/>
+              </w:rPr>
+              <w:t>BOOK_REVIEW</w:t>
+            </w:r>
+          </w:p>
+        </w:tc>
+        <w:tc>
+          <w:tcPr>
+            <w:tcW w:type="dxa" w:w="3009"/>
+          </w:tcPr>
+          <w:p>
+            <w:r>
+              <w:rPr>
+                <w:rFonts w:ascii="Arial" w:hAnsi="Arial"/>
+              </w:rPr>
+              <w:t>id SERIAL; book_id INTEGER; member_id INTEGER; rating SMALLINT; review_text TEXT; created_at TIMESTAMP</w:t>
+            </w:r>
+          </w:p>
+        </w:tc>
+        <w:tc>
+          <w:tcPr>
+            <w:tcW w:type="dxa" w:w="3009"/>
+          </w:tcPr>
+          <w:p>
+            <w:r>
+              <w:rPr>
+                <w:rFonts w:ascii="Arial" w:hAnsi="Arial"/>
+              </w:rPr>
+              <w:t>id is PK; book_id and member_id are FKs; rating is 1 to 5; one review per member and book.</w:t>
+            </w:r>
+          </w:p>
+        </w:tc>
+      </w:tr>
+      <w:tr>
+        <w:tc>
+          <w:tcPr>
+            <w:tcW w:type="dxa" w:w="3009"/>
+          </w:tcPr>
+          <w:p>
+            <w:r>
+              <w:rPr>
+                <w:rFonts w:ascii="Arial" w:hAnsi="Arial"/>
+              </w:rPr>
+              <w:t>NOTIFICATION</w:t>
+            </w:r>
+          </w:p>
+        </w:tc>
+        <w:tc>
+          <w:tcPr>
+            <w:tcW w:type="dxa" w:w="3009"/>
+          </w:tcPr>
+          <w:p>
+            <w:r>
+              <w:rPr>
+                <w:rFonts w:ascii="Arial" w:hAnsi="Arial"/>
+              </w:rPr>
+              <w:t>id SERIAL; member_id INTEGER; loan_id INTEGER; reservation_id INTEGER; notification_type VARCHAR(30); title VARCHAR(255); message TEXT; is_read BOOLEAN; created_at TIMESTAMP</w:t>
+            </w:r>
+          </w:p>
+        </w:tc>
+        <w:tc>
+          <w:tcPr>
+            <w:tcW w:type="dxa" w:w="3009"/>
+          </w:tcPr>
+          <w:p>
+            <w:r>
+              <w:rPr>
+                <w:rFonts w:ascii="Arial" w:hAnsi="Arial"/>
+              </w:rPr>
+              <w:t>id is PK; links to MEMBER and optionally LOAN or RESERVATION; notification type is controlled.</w:t>
+            </w:r>
+          </w:p>
+        </w:tc>
+      </w:tr>
+      <w:tr>
+        <w:tc>
+          <w:tcPr>
+            <w:tcW w:type="dxa" w:w="3009"/>
+          </w:tcPr>
+          <w:p>
+            <w:r>
+              <w:rPr>
+                <w:rFonts w:ascii="Arial" w:hAnsi="Arial"/>
+              </w:rPr>
+              <w:t>PASSWORD_RESET</w:t>
+            </w:r>
+          </w:p>
+        </w:tc>
+        <w:tc>
+          <w:tcPr>
+            <w:tcW w:type="dxa" w:w="3009"/>
+          </w:tcPr>
+          <w:p>
+            <w:r>
+              <w:rPr>
+                <w:rFonts w:ascii="Arial" w:hAnsi="Arial"/>
+              </w:rPr>
+              <w:t>id SERIAL; member_id INTEGER; reset_token VARCHAR(255); expires_at TIMESTAMP; used BOOLEAN; created_at TIMESTAMP</w:t>
+            </w:r>
+          </w:p>
+        </w:tc>
+        <w:tc>
+          <w:tcPr>
+            <w:tcW w:type="dxa" w:w="3009"/>
+          </w:tcPr>
+          <w:p>
+            <w:r>
+              <w:rPr>
+                <w:rFonts w:ascii="Arial" w:hAnsi="Arial"/>
+              </w:rPr>
+              <w:t>id is PK; member_id is FK to MEMBER; reset_token is UNIQUE.</w:t>
+            </w:r>
+          </w:p>
+        </w:tc>
+      </w:tr>
+      <w:tr>
+        <w:tc>
+          <w:tcPr>
+            <w:tcW w:type="dxa" w:w="3009"/>
+          </w:tcPr>
+          <w:p>
+            <w:r>
+              <w:rPr>
+                <w:rFonts w:ascii="Arial" w:hAnsi="Arial"/>
+              </w:rPr>
+              <w:t>PURCHASE_REQUEST</w:t>
+            </w:r>
+          </w:p>
+        </w:tc>
+        <w:tc>
+          <w:tcPr>
+            <w:tcW w:type="dxa" w:w="3009"/>
+          </w:tcPr>
+          <w:p>
+            <w:r>
+              <w:rPr>
+                <w:rFonts w:ascii="Arial" w:hAnsi="Arial"/>
+              </w:rPr>
+              <w:t>id SERIAL; member_id INTEGER; title VARCHAR(255); author VARCHAR(255); reason TEXT; request_date DATE; status VARCHAR(30)</w:t>
+            </w:r>
+          </w:p>
+        </w:tc>
+        <w:tc>
+          <w:tcPr>
+            <w:tcW w:type="dxa" w:w="3009"/>
+          </w:tcPr>
+          <w:p>
+            <w:r>
+              <w:rPr>
+                <w:rFonts w:ascii="Arial" w:hAnsi="Arial"/>
+              </w:rPr>
+              <w:t>id is PK; member_id is FK to MEMBER; status is PENDING, APPROVED, REJECTED, or ORDERED.</w:t>
+            </w:r>
+          </w:p>
+        </w:tc>
+      </w:tr>
+      <w:tr>
+        <w:tc>
+          <w:tcPr>
+            <w:tcW w:type="dxa" w:w="3009"/>
+          </w:tcPr>
+          <w:p>
+            <w:r>
+              <w:rPr>
+                <w:rFonts w:ascii="Arial" w:hAnsi="Arial"/>
               </w:rPr>
               <w:t>ANNOUNCEMENT</w:t>
             </w:r>
@@ -17137,18 +17001,12 @@
         </w:tc>
         <w:tc>
           <w:tcPr>
-            <w:tcW w:type="dxa" w:w="5472"/>
-            <w:vAlign w:val="center"/>
+            <w:tcW w:type="dxa" w:w="3009"/>
           </w:tcPr>
           <w:p>
-            <w:pPr>
-              <w:spacing w:after="0" w:before="0"/>
-            </w:pPr>
-            <w:r/>
             <w:r>
               <w:rPr>
-                <w:b w:val="0"/>
-                <w:sz w:val="17"/>
+                <w:rFonts w:ascii="Arial" w:hAnsi="Arial"/>
               </w:rPr>
               <w:t>id SERIAL; title VARCHAR(255); body TEXT; created_at TIMESTAMP; created_by INTEGER</w:t>
             </w:r>
@@ -17156,20 +17014,55 @@
         </w:tc>
         <w:tc>
           <w:tcPr>
-            <w:tcW w:type="dxa" w:w="3024"/>
-            <w:vAlign w:val="center"/>
+            <w:tcW w:type="dxa" w:w="3009"/>
           </w:tcPr>
           <w:p>
-            <w:pPr>
-              <w:spacing w:after="0" w:before="0"/>
-            </w:pPr>
-            <w:r/>
             <w:r>
               <w:rPr>
-                <w:b w:val="0"/>
-                <w:sz w:val="17"/>
+                <w:rFonts w:ascii="Arial" w:hAnsi="Arial"/>
               </w:rPr>
-              <w:t>id is PK; title and body are NOT NULL; created_at defaults to CURRENT_TIMESTAMP; created_by is FK to MEMBER.</w:t>
+              <w:t>id is PK; created_by is an optional FK to MEMBER.</w:t>
+            </w:r>
+          </w:p>
+        </w:tc>
+      </w:tr>
+      <w:tr>
+        <w:tc>
+          <w:tcPr>
+            <w:tcW w:type="dxa" w:w="3009"/>
+          </w:tcPr>
+          <w:p>
+            <w:r>
+              <w:rPr>
+                <w:rFonts w:ascii="Arial" w:hAnsi="Arial"/>
+              </w:rPr>
+              <w:t>AUDIT_LOG</w:t>
+            </w:r>
+          </w:p>
+        </w:tc>
+        <w:tc>
+          <w:tcPr>
+            <w:tcW w:type="dxa" w:w="3009"/>
+          </w:tcPr>
+          <w:p>
+            <w:r>
+              <w:rPr>
+                <w:rFonts w:ascii="Arial" w:hAnsi="Arial"/>
+              </w:rPr>
+              <w:t>id SERIAL; member_id INTEGER; action VARCHAR(100); details TEXT; created_at TIMESTAMP</w:t>
+            </w:r>
+          </w:p>
+        </w:tc>
+        <w:tc>
+          <w:tcPr>
+            <w:tcW w:type="dxa" w:w="3009"/>
+          </w:tcPr>
+          <w:p>
+            <w:r>
+              <w:rPr>
+                <w:rFonts w:ascii="Arial" w:hAnsi="Arial"/>
+              </w:rPr>
+              <w:t>id is PK; member_id is an optional FK to MEMBER.</w:t>
             </w:r>
           </w:p>
         </w:tc>
@@ -17292,13 +17185,7 @@
     </w:p>
     <w:p>
       <w:r>
-        <w:rPr>
-          <w:b/>
-        </w:rPr>
-        <w:t xml:space="preserve">Important. </w:t>
-      </w:r>
-      <w:r>
-        <w:t>The application code references the following tables, but no CREATE TABLE statement for them is included in the supplied schema or migration scripts. They must be added before a clean database setup can run all application features.</w:t>
+        <w:t>The consolidated schema now creates every table referenced by the implemented application. The earlier manual migration scripts are retained as historical development steps; new installations should run database/schema.sql followed by database/sample-data.sql.</w:t>
       </w:r>
     </w:p>
     <w:tbl>
@@ -17320,17 +17207,11 @@
             <w:vAlign w:val="center"/>
           </w:tcPr>
           <w:p>
-            <w:pPr>
-              <w:spacing w:after="0" w:before="0"/>
-            </w:pPr>
-            <w:r/>
             <w:r>
               <w:rPr>
-                <w:b/>
-                <w:color w:val="FFFFFF"/>
-                <w:sz w:val="17"/>
+                <w:rFonts w:ascii="Arial" w:hAnsi="Arial"/>
               </w:rPr>
-              <w:t>Referenced table</w:t>
+              <w:t>Database rule</w:t>
             </w:r>
           </w:p>
         </w:tc>
@@ -17341,17 +17222,11 @@
             <w:vAlign w:val="center"/>
           </w:tcPr>
           <w:p>
-            <w:pPr>
-              <w:spacing w:after="0" w:before="0"/>
-            </w:pPr>
-            <w:r/>
             <w:r>
               <w:rPr>
-                <w:b/>
-                <w:color w:val="FFFFFF"/>
-                <w:sz w:val="17"/>
+                <w:rFonts w:ascii="Arial" w:hAnsi="Arial"/>
               </w:rPr>
-              <w:t>Feature relying on it</w:t>
+              <w:t>Implementation</w:t>
             </w:r>
           </w:p>
         </w:tc>
@@ -17359,39 +17234,27 @@
       <w:tr>
         <w:tc>
           <w:tcPr>
-            <w:tcW w:type="dxa" w:w="2448"/>
-            <w:vAlign w:val="center"/>
+            <w:tcW w:type="dxa" w:w="4513"/>
           </w:tcPr>
           <w:p>
-            <w:pPr>
-              <w:spacing w:after="0" w:before="0"/>
-            </w:pPr>
-            <w:r/>
             <w:r>
               <w:rPr>
-                <w:b w:val="0"/>
-                <w:sz w:val="17"/>
+                <w:rFonts w:ascii="Arial" w:hAnsi="Arial"/>
               </w:rPr>
-              <w:t>AUDIT_LOG</w:t>
+              <w:t>Physical-copy availability</w:t>
             </w:r>
           </w:p>
         </w:tc>
         <w:tc>
           <w:tcPr>
-            <w:tcW w:type="dxa" w:w="7632"/>
-            <w:vAlign w:val="center"/>
+            <w:tcW w:type="dxa" w:w="4513"/>
           </w:tcPr>
           <w:p>
-            <w:pPr>
-              <w:spacing w:after="0" w:before="0"/>
-            </w:pPr>
-            <w:r/>
             <w:r>
               <w:rPr>
-                <w:b w:val="0"/>
-                <w:sz w:val="17"/>
+                <w:rFonts w:ascii="Arial" w:hAnsi="Arial"/>
               </w:rPr>
-              <w:t>Records administrative actions through the log_action helper.</w:t>
+              <w:t>BOOK_COPY stores the availability of each physical item. A partial unique index prevents a copy from being actively loaned to more than one member.</w:t>
             </w:r>
           </w:p>
         </w:tc>
@@ -17399,39 +17262,27 @@
       <w:tr>
         <w:tc>
           <w:tcPr>
-            <w:tcW w:type="dxa" w:w="2448"/>
-            <w:vAlign w:val="center"/>
+            <w:tcW w:type="dxa" w:w="4513"/>
           </w:tcPr>
           <w:p>
-            <w:pPr>
-              <w:spacing w:after="0" w:before="0"/>
-            </w:pPr>
-            <w:r/>
             <w:r>
               <w:rPr>
-                <w:b w:val="0"/>
-                <w:sz w:val="17"/>
+                <w:rFonts w:ascii="Arial" w:hAnsi="Arial"/>
               </w:rPr>
-              <w:t>PURCHASE_REQUEST</w:t>
+              <w:t>Reservation queue</w:t>
             </w:r>
           </w:p>
         </w:tc>
         <w:tc>
           <w:tcPr>
-            <w:tcW w:type="dxa" w:w="7632"/>
-            <w:vAlign w:val="center"/>
+            <w:tcW w:type="dxa" w:w="4513"/>
           </w:tcPr>
           <w:p>
-            <w:pPr>
-              <w:spacing w:after="0" w:before="0"/>
-            </w:pPr>
-            <w:r/>
             <w:r>
               <w:rPr>
-                <w:b w:val="0"/>
-                <w:sz w:val="17"/>
+                <w:rFonts w:ascii="Arial" w:hAnsi="Arial"/>
               </w:rPr>
-              <w:t>Stores member requests for new books.</w:t>
+              <w:t>RESERVATION records the queue position and optional allocated copy. Partial unique indexes prevent duplicate active reservations and duplicate pending positions for a book.</w:t>
             </w:r>
           </w:p>
         </w:tc>
@@ -17439,39 +17290,27 @@
       <w:tr>
         <w:tc>
           <w:tcPr>
-            <w:tcW w:type="dxa" w:w="2448"/>
-            <w:vAlign w:val="center"/>
+            <w:tcW w:type="dxa" w:w="4513"/>
           </w:tcPr>
           <w:p>
-            <w:pPr>
-              <w:spacing w:after="0" w:before="0"/>
-            </w:pPr>
-            <w:r/>
             <w:r>
               <w:rPr>
-                <w:b w:val="0"/>
-                <w:sz w:val="17"/>
+                <w:rFonts w:ascii="Arial" w:hAnsi="Arial"/>
               </w:rPr>
-              <w:t>PASSWORD_RESET</w:t>
+              <w:t>Account and authentication</w:t>
             </w:r>
           </w:p>
         </w:tc>
         <w:tc>
           <w:tcPr>
-            <w:tcW w:type="dxa" w:w="7632"/>
-            <w:vAlign w:val="center"/>
+            <w:tcW w:type="dxa" w:w="4513"/>
           </w:tcPr>
           <w:p>
-            <w:pPr>
-              <w:spacing w:after="0" w:before="0"/>
-            </w:pPr>
-            <w:r/>
             <w:r>
               <w:rPr>
-                <w:b w:val="0"/>
-                <w:sz w:val="17"/>
+                <w:rFonts w:ascii="Arial" w:hAnsi="Arial"/>
               </w:rPr>
-              <w:t>Stores password-reset tokens and expiry information.</w:t>
+              <w:t>MEMBER.email is unique, passwords are stored as hashes, and PASSWORD_RESET tokens are unique and time-limited.</w:t>
             </w:r>
           </w:p>
         </w:tc>
@@ -17479,39 +17318,27 @@
       <w:tr>
         <w:tc>
           <w:tcPr>
-            <w:tcW w:type="dxa" w:w="2448"/>
-            <w:vAlign w:val="center"/>
+            <w:tcW w:type="dxa" w:w="4513"/>
           </w:tcPr>
           <w:p>
-            <w:pPr>
-              <w:spacing w:after="0" w:before="0"/>
-            </w:pPr>
-            <w:r/>
             <w:r>
               <w:rPr>
-                <w:b w:val="0"/>
-                <w:sz w:val="17"/>
+                <w:rFonts w:ascii="Arial" w:hAnsi="Arial"/>
               </w:rPr>
-              <w:t>BOOK_REVIEW</w:t>
+              <w:t>Ratings and recommendations</w:t>
             </w:r>
           </w:p>
         </w:tc>
         <w:tc>
           <w:tcPr>
-            <w:tcW w:type="dxa" w:w="7632"/>
-            <w:vAlign w:val="center"/>
+            <w:tcW w:type="dxa" w:w="4513"/>
           </w:tcPr>
           <w:p>
-            <w:pPr>
-              <w:spacing w:after="0" w:before="0"/>
-            </w:pPr>
-            <w:r/>
             <w:r>
               <w:rPr>
-                <w:b w:val="0"/>
-                <w:sz w:val="17"/>
+                <w:rFonts w:ascii="Arial" w:hAnsi="Arial"/>
               </w:rPr>
-              <w:t>Stores ratings and written reviews used by recommendation logic.</w:t>
+              <w:t>BOOK_REVIEW limits a member to one rating per book. The application confirms borrowing history before accepting a review; MEMBER_INTEREST supports category-based recommendations.</w:t>
             </w:r>
           </w:p>
         </w:tc>
@@ -17519,79 +17346,27 @@
       <w:tr>
         <w:tc>
           <w:tcPr>
-            <w:tcW w:type="dxa" w:w="2448"/>
-            <w:vAlign w:val="center"/>
+            <w:tcW w:type="dxa" w:w="4513"/>
           </w:tcPr>
           <w:p>
-            <w:pPr>
-              <w:spacing w:after="0" w:before="0"/>
-            </w:pPr>
-            <w:r/>
             <w:r>
               <w:rPr>
-                <w:b w:val="0"/>
-                <w:sz w:val="17"/>
+                <w:rFonts w:ascii="Arial" w:hAnsi="Arial"/>
               </w:rPr>
-              <w:t>BOOK_COPY</w:t>
+              <w:t>Operational history</w:t>
             </w:r>
           </w:p>
         </w:tc>
         <w:tc>
           <w:tcPr>
-            <w:tcW w:type="dxa" w:w="7632"/>
-            <w:vAlign w:val="center"/>
+            <w:tcW w:type="dxa" w:w="4513"/>
           </w:tcPr>
           <w:p>
-            <w:pPr>
-              <w:spacing w:after="0" w:before="0"/>
-            </w:pPr>
-            <w:r/>
             <w:r>
               <w:rPr>
-                <w:b w:val="0"/>
-                <w:sz w:val="17"/>
+                <w:rFonts w:ascii="Arial" w:hAnsi="Arial"/>
               </w:rPr>
-              <w:t>Tracks individual physical copies, availability, and borrowing operations.</w:t>
-            </w:r>
-          </w:p>
-        </w:tc>
-      </w:tr>
-      <w:tr>
-        <w:tc>
-          <w:tcPr>
-            <w:tcW w:type="dxa" w:w="2448"/>
-            <w:vAlign w:val="center"/>
-          </w:tcPr>
-          <w:p>
-            <w:pPr>
-              <w:spacing w:after="0" w:before="0"/>
-            </w:pPr>
-            <w:r/>
-            <w:r>
-              <w:rPr>
-                <w:b w:val="0"/>
-                <w:sz w:val="17"/>
-              </w:rPr>
-              <w:t>NOTIFICATION</w:t>
-            </w:r>
-          </w:p>
-        </w:tc>
-        <w:tc>
-          <w:tcPr>
-            <w:tcW w:type="dxa" w:w="7632"/>
-            <w:vAlign w:val="center"/>
-          </w:tcPr>
-          <w:p>
-            <w:pPr>
-              <w:spacing w:after="0" w:before="0"/>
-            </w:pPr>
-            <w:r/>
-            <w:r>
-              <w:rPr>
-                <w:b w:val="0"/>
-                <w:sz w:val="17"/>
-              </w:rPr>
-              <w:t>Stores due-date and reservation notifications.</w:t>
+              <w:t>LOAN, FINE, FINE_PAYMENT, NOTIFICATION, AUDIT_LOG, PURCHASE_REQUEST, and ANNOUNCEMENT preserve library activity and administration records.</w:t>
             </w:r>
           </w:p>
         </w:tc>
@@ -17639,13 +17414,7 @@
         <w:ind w:left="360" w:hanging="216"/>
       </w:pPr>
       <w:r>
-        <w:rPr>
-          <w:b/>
-        </w:rPr>
-        <w:t xml:space="preserve">• </w:t>
-      </w:r>
-      <w:r>
-        <w:t>A book can be borrowed only when an available BOOK_COPY exists. This feature cannot be set up from the supplied schema until BOOK_COPY is defined.</w:t>
+        <w:t>• A book can be borrowed only when an available BOOK_COPY exists. Each active loan is linked to one physical copy, and the database permits only one active loan per copy.</w:t>
       </w:r>
     </w:p>
     <w:p>

</xml_diff>